<commit_message>
Introduction: drop results preview; add clean final draft
Co-Authored-By: Claude Opus 5.5 <noreply@anthropic.com>
Claude-Session: https://claude.ai/code/session_011wQfVcjqSLDCo2NCokAy4g
</commit_message>
<xml_diff>
--- a/manuscript/zh/引言融合稿_老师版本+修订稿.docx
+++ b/manuscript/zh/引言融合稿_老师版本+修订稿.docx
@@ -422,7 +422,7 @@
         <w:pStyle w:val="BodyText"/>
       </w:pPr>
       <w:r>
-        <w:t xml:space="preserve">To address these issues, we construct a complete comparison matrix of waveform and handcrafted-feature encoders under a unified experimental protocol, with identical data splits, preprocessing and training budgets. The matrix includes five waveform encoders with convolutional, fully connected, temporal convolutional [38], point-wise attention [39] and patch-based [40] architectures, and three handcrafted-feature encoders: a multilayer perceptron (MLP), a ResNet and an FT-Transformer [41]. All combinations are compared using cell-disjoint cross-validation. Unlike fusion studies that select branch encoders in advance [23–25] or model comparisons using a single input [27], this design estimates main effects, tests dependence on encoder pairing and attributes error differences to the encoders themselves. Based on the matrix, we develop a dual-branch model consisting of a primary handcrafted-feature branch, encoded by an MLP and incorporating operating context and cumulative cycling information, and a supplementary branch of patch-based waveform representations, for which a concrete adaptation of PatchTST from time-series forecasting to scalar SOH estimation is presented. The two branches are fused at a late stage. To reflect the general decline of capacity with cycling, a soft monotonicity constraint on predicted SOH with respect to the cumulative cycle count is imposed; unlike approaches built on degradation dynamics, mechanistic features or digital twins [47–49], it requires no mechanistic model. Ablation studies and cell-level statistical analysis quantify the contribution of each design factor. The waveform supplement reduces the error on most cells relative to handcrafted features alone, whereas removing the handcrafted-feature branch increases it, supporting the use of a learned waveform encoder to supplement rather than replace handcrafted features.</w:t>
+        <w:t xml:space="preserve">To address these issues, we construct a complete comparison matrix of waveform and handcrafted-feature encoders under a unified experimental protocol, with identical data splits, preprocessing and training budgets. The matrix includes five waveform encoders with convolutional, fully connected, temporal convolutional [38], point-wise attention [39] and patch-based [40] architectures, and three handcrafted-feature encoders: a multilayer perceptron (MLP), a ResNet and an FT-Transformer [41]. All combinations are compared using cell-disjoint cross-validation. Unlike fusion studies that select branch encoders in advance [23–25] or model comparisons using a single input [27], this design estimates main effects, tests dependence on encoder pairing and attributes error differences to the encoders themselves. Based on the matrix, we develop a dual-branch model consisting of a primary handcrafted-feature branch, encoded by an MLP and incorporating operating context and cumulative cycling information, and a supplementary branch of patch-based waveform representations, for which a concrete adaptation of PatchTST from time-series forecasting to scalar SOH estimation is presented. The two branches are fused at a late stage. To reflect the general decline of capacity with cycling, a soft monotonicity constraint on predicted SOH with respect to the cumulative cycle count is imposed; unlike approaches built on degradation dynamics, mechanistic features or digital twins [47–49], it requires no mechanistic model. Ablation studies and cell-level statistical analysis quantify the contribution of each design factor.</w:t>
       </w:r>
     </w:p>
     <w:p>
@@ -533,7 +533,7 @@
         <w:pStyle w:val="BodyText"/>
       </w:pPr>
       <w:r>
-        <w:t xml:space="preserve">针对上述问题，本文在统一实验协议下构建波形编码器与人工特征编码器的完整比较矩阵，各组合采用相同的数据划分、预处理和训练预算。矩阵包括卷积、全连接、时间卷积[38]、逐点注意力[39]和片段化[40]5种结构的波形编码器，以及多层感知机（MLP）、ResNet和FT-Transformer[41]3种人工特征编码器，全部组合均以电芯互斥交叉验证进行比较。与预先选定分支编码器的融合研究[23–25]或只使用单一输入的模型比较[27]不同，该设计可以估计主效应、检验编码器组合依赖，并将误差差异归因于编码器本身。在比较矩阵的基础上，本文构建双分支模型：主分支为人工特征分支，由MLP编码，并纳入工况上下文和累计循环信息；补充分支为片段化波形表征，并给出将PatchTST由时间序列预测改造用于标量SOH估计的具体方案。两个分支在后期融合。为体现容量随循环总体下降的规律，本文对预测SOH关于累计循环数施加单调软约束；与基于退化动力学、机理特征或数字孪生的方法[47–49]不同，该约束不需要机理模型。消融实验和电芯层级的统计分析量化了各设计因素的贡献。结果表明，相对只用人工特征，波形补充降低了多数电芯的误差，而去掉人工特征分支会使误差增加，支持以学习型波形编码器补充而非替代人工特征。</w:t>
+        <w:t xml:space="preserve">针对上述问题，本文在统一实验协议下构建波形编码器与人工特征编码器的完整比较矩阵，各组合采用相同的数据划分、预处理和训练预算。矩阵包括卷积、全连接、时间卷积[38]、逐点注意力[39]和片段化[40]5种结构的波形编码器，以及多层感知机（MLP）、ResNet和FT-Transformer[41]3种人工特征编码器，全部组合均以电芯互斥交叉验证进行比较。与预先选定分支编码器的融合研究[23–25]或只使用单一输入的模型比较[27]不同，该设计可以估计主效应、检验编码器组合依赖，并将误差差异归因于编码器本身。在比较矩阵的基础上，本文构建双分支模型：主分支为人工特征分支，由MLP编码，并纳入工况上下文和累计循环信息；补充分支为片段化波形表征，并给出将PatchTST由时间序列预测改造用于标量SOH估计的具体方案。两个分支在后期融合。为体现容量随循环总体下降的规律，本文对预测SOH关于累计循环数施加单调软约束；与基于退化动力学、机理特征或数字孪生的方法[47–49]不同，该约束不需要机理模型。消融实验和电芯层级的统计分析量化了各设计因素的贡献。</w:t>
       </w:r>
     </w:p>
     <w:p>

</xml_diff>